<commit_message>
L1SignalFabric: day-2 connector rework + Outlook/SharePoint live-verification
Working-tree iteration on top of the initial six-connector commit (dd573c5):
Graph app-only (msal) rewrite for the Outlook and SharePoint clients/connectors,
metadata-only refinements, and aligned slack/notion/core, tests, and the
design/plan/impl/test docs. Marks Outlook + SharePoint LIVE-verified against the
real Microsoft 365 tenant in the test/critic agents.

Co-Authored-By: Claude Opus 4.8 (1M context) <noreply@anthropic.com>
</commit_message>
<xml_diff>
--- a/L1SignalFabric/docs/L1_SignalFabric_Implementation.docx
+++ b/L1SignalFabric/docs/L1_SignalFabric_Implementation.docx
@@ -2778,7 +2778,7 @@
     </w:p>
     <w:p>
       <w:r>
-        <w:t xml:space="preserve">realization of Conduit's stubbed Phase-3 </w:t>
+        <w:t xml:space="preserve">realization of the upstream stubbed Phase-3 </w:t>
       </w:r>
       <w:r>
         <w:rPr>
@@ -7521,7 +7521,7 @@
     </w:p>
     <w:p>
       <w:r>
-        <w:t xml:space="preserve">bus / L2 sink consume. 1:1 with the upstream Conduit </w:t>
+        <w:t xml:space="preserve">bus / L2 sink consume. 1:1 with the upstream </w:t>
       </w:r>
       <w:r>
         <w:rPr>
@@ -7536,7 +7536,7 @@
     </w:p>
     <w:p>
       <w:r>
-        <w:t>tenantId, data, operation, timestamp, lineage) so the stream stays Conduit-compatible — the</w:t>
+        <w:t>tenantId, data, operation, timestamp, lineage) so the stream stays batch-compatible — the</w:t>
       </w:r>
     </w:p>
     <w:p>
@@ -7787,7 +7787,7 @@
               <w:t>SNAPSHOT</w:t>
             </w:r>
             <w:r>
-              <w:t xml:space="preserve"> (Conduit batch parity)</w:t>
+              <w:t xml:space="preserve"> (upstream batch parity)</w:t>
             </w:r>
           </w:p>
         </w:tc>
@@ -7822,7 +7822,7 @@
     <w:p/>
     <w:p>
       <w:r>
-        <w:t>Dependency-light (pydantic only) so it can be vendored back into Conduit unchanged.</w:t>
+        <w:t>Dependency-light (pydantic only) so it can be vendored back upstream unchanged.</w:t>
       </w:r>
     </w:p>
     <w:p>

</xml_diff>